<commit_message>
El resumen para conversar incorpora la correccion del carbono
Agrega tres cosas en lenguaje llano: la diferencia entre medir y estimar,
la formula de valoracion del Art. 32 (que para conversar con vecinos pesa
mas que cualquier cifra de carbono, porque es el precio que fijo el
propio municipio), y los dos productos del proyecto.

Reescribe 'lo que este proyecto no promete': ya no dice que no hablaremos
de CO2, dice que lo estimaremos y no lo mediremos, y explica la
diferencia. El oxigeno pasa a ser ejemplo de alfabetizacion cientifica y
los liquenes entran como indicadores de calidad del aire.

Co-Authored-By: Claude Opus 5 <noreply@anthropic.com>
</commit_message>
<xml_diff>
--- a/postulaciones/RESUMEN_PARA_CONVERSAR.docx
+++ b/postulaciones/RESUMEN_PARA_CONVERSAR.docx
@@ -419,6 +419,378 @@
       </w:r>
       <w:r>
         <w:t xml:space="preserve"> que además dice qué vive en cada árbol.</w:t>
+      </w:r>
+    </w:p>
+    <w:p>
+      <w:pPr>
+        <w:spacing w:before="40" w:after="120"/>
+        <w:pBdr>
+          <w:bottom w:val="single" w:sz="6" w:color="BBBBBB"/>
+        </w:pBdr>
+      </w:pPr>
+    </w:p>
+    <w:p>
+      <w:pPr>
+        <w:pStyle w:val="Heading2"/>
+      </w:pPr>
+      <w:r>
+        <w:rPr>
+          <w:color w:val="1B4D3E"/>
+        </w:rPr>
+        <w:t>Y con esas mismas medidas se puede calcular bastante más</w:t>
+      </w:r>
+    </w:p>
+    <w:p>
+      <w:pPr>
+        <w:spacing w:after="120"/>
+      </w:pPr>
+      <w:r>
+        <w:t>Acá hay algo que conviene explicar bien, porque es donde más se confunde la gente —y donde nosotros mismos nos habíamos confundido.</w:t>
+      </w:r>
+    </w:p>
+    <w:p>
+      <w:pPr>
+        <w:spacing w:after="120"/>
+      </w:pPr>
+      <w:r>
+        <w:rPr>
+          <w:b/>
+        </w:rPr>
+        <w:t>Una cosa es medir y otra es estimar.</w:t>
+      </w:r>
+      <w:r>
+        <w:t xml:space="preserve"> Los estudiantes miden el tronco con una huincha. Eso es medir. Pero a partir de ese diámetro, la especie y el estado del árbol, </w:t>
+      </w:r>
+      <w:r>
+        <w:rPr>
+          <w:b/>
+        </w:rPr>
+        <w:t>modelos científicos ya existentes permiten estimar</w:t>
+      </w:r>
+      <w:r>
+        <w:t xml:space="preserve"> cosas que nadie puede medir directamente con una huincha:</w:t>
+      </w:r>
+    </w:p>
+    <w:p>
+      <w:pPr>
+        <w:pStyle w:val="ListBullet"/>
+      </w:pPr>
+      <w:r>
+        <w:rPr>
+          <w:b/>
+        </w:rPr>
+        <w:t>Cuánto carbono tiene acumulado ese árbol</w:t>
+      </w:r>
+      <w:r>
+        <w:t xml:space="preserve"> en su madera, después de toda su vida.</w:t>
+      </w:r>
+    </w:p>
+    <w:p>
+      <w:pPr>
+        <w:pStyle w:val="ListBullet"/>
+      </w:pPr>
+      <w:r>
+        <w:rPr>
+          <w:b/>
+        </w:rPr>
+        <w:t>Cuánto carbono captura aproximadamente cada año</w:t>
+      </w:r>
+      <w:r>
+        <w:t>, según su especie, su tamaño y qué tan sano está.</w:t>
+      </w:r>
+    </w:p>
+    <w:p>
+      <w:pPr>
+        <w:pStyle w:val="ListBullet"/>
+      </w:pPr>
+      <w:r>
+        <w:rPr>
+          <w:b/>
+        </w:rPr>
+        <w:t>Cuánta sombra proyecta</w:t>
+      </w:r>
+      <w:r>
+        <w:t>, que sale de la geometría de la copa.</w:t>
+      </w:r>
+    </w:p>
+    <w:p>
+      <w:pPr>
+        <w:pStyle w:val="ListBullet"/>
+      </w:pPr>
+      <w:r>
+        <w:rPr>
+          <w:b/>
+        </w:rPr>
+        <w:t>Y cuánto vale ese árbol en pesos</w:t>
+      </w:r>
+      <w:r>
+        <w:t>, según una fórmula que ya existe.</w:t>
+      </w:r>
+    </w:p>
+    <w:p>
+      <w:pPr>
+        <w:spacing w:after="120"/>
+      </w:pPr>
+      <w:r>
+        <w:t>Esa última es, probablemente, la más potente de todas.</w:t>
+      </w:r>
+    </w:p>
+    <w:p>
+      <w:pPr>
+        <w:pStyle w:val="Heading3"/>
+      </w:pPr>
+      <w:r>
+        <w:rPr>
+          <w:color w:val="1B4D3E"/>
+        </w:rPr>
+        <w:t>El árbol tiene un precio, y lo puso la propia Municipalidad</w:t>
+      </w:r>
+    </w:p>
+    <w:p>
+      <w:pPr>
+        <w:spacing w:after="120"/>
+      </w:pPr>
+      <w:r>
+        <w:t xml:space="preserve">La </w:t>
+      </w:r>
+      <w:r>
+        <w:rPr>
+          <w:b/>
+        </w:rPr>
+        <w:t>Ordenanza 004/2021 de Temuco</w:t>
+      </w:r>
+      <w:r>
+        <w:t xml:space="preserve"> —la misma que obliga al municipio a tener un catastro de árboles que no tiene— trae en su Artículo 32 una fórmula para calcular </w:t>
+      </w:r>
+      <w:r>
+        <w:rPr>
+          <w:b/>
+        </w:rPr>
+        <w:t>cuánto debe pagar quien daña o destruye un árbol</w:t>
+      </w:r>
+      <w:r>
+        <w:t xml:space="preserve"> en un espacio público.</w:t>
+      </w:r>
+    </w:p>
+    <w:p>
+      <w:pPr>
+        <w:spacing w:after="120"/>
+      </w:pPr>
+      <w:r>
+        <w:t xml:space="preserve">La fórmula toma un valor base según la </w:t>
+      </w:r>
+      <w:r>
+        <w:rPr>
+          <w:b/>
+        </w:rPr>
+        <w:t>especie</w:t>
+      </w:r>
+      <w:r>
+        <w:t xml:space="preserve"> y la </w:t>
+      </w:r>
+      <w:r>
+        <w:rPr>
+          <w:b/>
+        </w:rPr>
+        <w:t>edad</w:t>
+      </w:r>
+      <w:r>
+        <w:t xml:space="preserve"> del árbol, y lo multiplica por tres factores:</w:t>
+      </w:r>
+    </w:p>
+    <w:p>
+      <w:pPr>
+        <w:pStyle w:val="ListBullet"/>
+      </w:pPr>
+      <w:r>
+        <w:rPr>
+          <w:b/>
+        </w:rPr>
+        <w:t>Qué tan sano está</w:t>
+      </w:r>
+      <w:r>
+        <w:t>: un árbol sano vale el 100%; uno muerto, cero.</w:t>
+      </w:r>
+    </w:p>
+    <w:p>
+      <w:pPr>
+        <w:pStyle w:val="ListBullet"/>
+      </w:pPr>
+      <w:r>
+        <w:rPr>
+          <w:b/>
+        </w:rPr>
+        <w:t>Dónde está</w:t>
+      </w:r>
+      <w:r>
+        <w:t>: en una plaza o parque vale el doble; en una calle poco visible, la mitad.</w:t>
+      </w:r>
+    </w:p>
+    <w:p>
+      <w:pPr>
+        <w:pStyle w:val="ListBullet"/>
+      </w:pPr>
+      <w:r>
+        <w:rPr>
+          <w:b/>
+        </w:rPr>
+        <w:t>Qué tan singular es</w:t>
+      </w:r>
+      <w:r>
+        <w:t xml:space="preserve">: un árbol declarado patrimonial vale </w:t>
+      </w:r>
+      <w:r>
+        <w:rPr>
+          <w:b/>
+        </w:rPr>
+        <w:t>cinco veces más</w:t>
+      </w:r>
+      <w:r>
+        <w:t xml:space="preserve">; un monumento natural, </w:t>
+      </w:r>
+      <w:r>
+        <w:rPr>
+          <w:b/>
+        </w:rPr>
+        <w:t>siete veces más</w:t>
+      </w:r>
+      <w:r>
+        <w:t>.</w:t>
+      </w:r>
+    </w:p>
+    <w:p>
+      <w:pPr>
+        <w:spacing w:after="120"/>
+      </w:pPr>
+      <w:r>
+        <w:rPr>
+          <w:b/>
+        </w:rPr>
+        <w:t>Y todas esas variables son exactamente las que los estudiantes van a registrar.</w:t>
+      </w:r>
+    </w:p>
+    <w:p>
+      <w:pPr>
+        <w:spacing w:after="120"/>
+      </w:pPr>
+      <w:r>
+        <w:t xml:space="preserve">Eso significa que al terminar podríamos decir, árbol por árbol: </w:t>
+      </w:r>
+      <w:r>
+        <w:rPr>
+          <w:i/>
+        </w:rPr>
+        <w:t>"este ejemplar vale tantas UTM según la ordenanza de tu propia municipalidad"</w:t>
+      </w:r>
+      <w:r>
+        <w:t xml:space="preserve">. No es una opinión ni un dato importado de otro país: </w:t>
+      </w:r>
+      <w:r>
+        <w:rPr>
+          <w:b/>
+        </w:rPr>
+        <w:t>es el precio que el municipio fijó por escrito.</w:t>
+      </w:r>
+      <w:r>
+        <w:t xml:space="preserve"> Y cuando alguien tale uno de esos árboles, ese número es lo que corresponde cobrar.</w:t>
+      </w:r>
+    </w:p>
+    <w:p>
+      <w:pPr>
+        <w:spacing w:after="120"/>
+      </w:pPr>
+      <w:r>
+        <w:t>Para una comunidad que quiere defender los árboles de su barrio, eso es una herramienta mucho más útil que cualquier cifra ambiental abstracta.</w:t>
+      </w:r>
+    </w:p>
+    <w:p>
+      <w:pPr>
+        <w:spacing w:before="40" w:after="120"/>
+        <w:pBdr>
+          <w:bottom w:val="single" w:sz="6" w:color="BBBBBB"/>
+        </w:pBdr>
+      </w:pPr>
+    </w:p>
+    <w:p>
+      <w:pPr>
+        <w:pStyle w:val="Heading2"/>
+      </w:pPr>
+      <w:r>
+        <w:rPr>
+          <w:color w:val="1B4D3E"/>
+        </w:rPr>
+        <w:t>El proyecto tiene dos productos, no uno</w:t>
+      </w:r>
+    </w:p>
+    <w:p>
+      <w:pPr>
+        <w:spacing w:after="120"/>
+      </w:pPr>
+      <w:r>
+        <w:t>Esto es importante para entender por qué nueve meses alcanzan y por qué el proyecto no termina ahí.</w:t>
+      </w:r>
+    </w:p>
+    <w:p>
+      <w:pPr>
+        <w:spacing w:after="120"/>
+      </w:pPr>
+      <w:r>
+        <w:rPr>
+          <w:b/>
+        </w:rPr>
+        <w:t>Producto 1: la línea base.</w:t>
+      </w:r>
+      <w:r>
+        <w:t xml:space="preserve"> ¿Qué árboles tenemos hoy, cómo son, qué vida sostienen y cuánto valen? Es la fotografía del punto de partida, y no existe hoy para Temuco.</w:t>
+      </w:r>
+    </w:p>
+    <w:p>
+      <w:pPr>
+        <w:spacing w:after="120"/>
+      </w:pPr>
+      <w:r>
+        <w:rPr>
+          <w:b/>
+        </w:rPr>
+        <w:t>Producto 2: el sistema para volver a medir.</w:t>
+      </w:r>
+      <w:r>
+        <w:t xml:space="preserve"> Cada árbol queda con su código, sus coordenadas y sus fotos, y el protocolo queda en manos de los docentes. Eso permite que dentro de tres o cinco años alguien vuelva a medir </w:t>
+      </w:r>
+      <w:r>
+        <w:rPr>
+          <w:b/>
+        </w:rPr>
+        <w:t>los mismos árboles</w:t>
+      </w:r>
+      <w:r>
+        <w:t xml:space="preserve"> y sepa cuánto crecieron, cuántos se perdieron, si cambió la vida que sostienen.</w:t>
+      </w:r>
+    </w:p>
+    <w:p>
+      <w:pPr>
+        <w:spacing w:after="120"/>
+      </w:pPr>
+      <w:r>
+        <w:t xml:space="preserve">Lo segundo es lo que convierte esto en un </w:t>
+      </w:r>
+      <w:r>
+        <w:rPr>
+          <w:b/>
+        </w:rPr>
+        <w:t>observatorio</w:t>
+      </w:r>
+      <w:r>
+        <w:t xml:space="preserve"> y no en un estudio que se archiva. Y hay algo que solo se puede saber así: hoy en Chile </w:t>
+      </w:r>
+      <w:r>
+        <w:rPr>
+          <w:b/>
+        </w:rPr>
+        <w:t>no existen ecuaciones de crecimiento para muchos árboles urbanos del sur</w:t>
+      </w:r>
+      <w:r>
+        <w:t>. Midiendo los mismos ejemplares en el tiempo, este proyecto podría ayudar a construirlas. Pero para eso hay que empezar ahora.</w:t>
       </w:r>
     </w:p>
     <w:p>
@@ -1527,10 +1899,19 @@
         <w:rPr>
           <w:b/>
         </w:rPr>
-        <w:t>No vamos a decir cuánto CO₂ capturan los árboles.</w:t>
+        <w:t>No vamos a decir que "medimos" el CO₂ que capturaron los árboles.</w:t>
       </w:r>
       <w:r>
-        <w:t xml:space="preserve"> Medir eso requiere volver a medir los mismos árboles varios años después. En nueve meses es físicamente imposible, y prometerlo sería mentir.</w:t>
+        <w:t xml:space="preserve"> Lo vamos a </w:t>
+      </w:r>
+      <w:r>
+        <w:rPr>
+          <w:b/>
+        </w:rPr>
+        <w:t>estimar</w:t>
+      </w:r>
+      <w:r>
+        <w:t xml:space="preserve"> con modelos científicos, y esas dos palabras no son lo mismo. Comprobar si la estimación fue correcta exige volver a medir los mismos árboles años después — para eso queda instalado el sistema de monitoreo. Cada cifra irá acompañada de cómo se calculó y de cuánto puede equivocarse.</w:t>
       </w:r>
     </w:p>
     <w:p>
@@ -1544,7 +1925,16 @@
         <w:t>No vamos a decir que los árboles limpian el aire.</w:t>
       </w:r>
       <w:r>
-        <w:t xml:space="preserve"> En calles con tráfico las copas pueden incluso atrapar la contaminación. Es un tema interesante para enseñar, no una cifra para publicar.</w:t>
+        <w:t xml:space="preserve"> El efecto real es pequeño, y en calles con tráfico las copas pueden incluso atrapar la contaminación. Pero el tema no lo abandonamos: </w:t>
+      </w:r>
+      <w:r>
+        <w:rPr>
+          <w:b/>
+        </w:rPr>
+        <w:t>los líquenes de la corteza son indicadores de la calidad del aire</w:t>
+      </w:r>
+      <w:r>
+        <w:t xml:space="preserve"> —no la limpian, la registran—, y eso sí lo pueden medir los estudiantes con una grilla y algo de paciencia.</w:t>
       </w:r>
     </w:p>
     <w:p>
@@ -1558,7 +1948,16 @@
         <w:t>No vamos a hablar del oxígeno que producen.</w:t>
       </w:r>
       <w:r>
-        <w:t xml:space="preserve"> Es una cifra que suena bien y que no significa nada; hasta quienes inventaron el método lo descartan.</w:t>
+        <w:t xml:space="preserve"> Es una cifra que suena impresionante y no aporta información nueva: se obtiene multiplicando la del carbono. Hasta quienes crearon el método la descartan. </w:t>
+      </w:r>
+      <w:r>
+        <w:rPr>
+          <w:b/>
+        </w:rPr>
+        <w:t>Sí la vamos a usar en clases</w:t>
+      </w:r>
+      <w:r>
+        <w:t>, justamente para enseñar a preguntarle a un número de dónde salió.</w:t>
       </w:r>
     </w:p>
     <w:p>
@@ -1572,7 +1971,16 @@
         <w:t>Lo que sí vamos a poder decir</w:t>
       </w:r>
       <w:r>
-        <w:t xml:space="preserve"> es cuánta sombra dan, cuánto más fresco es un lugar con árboles —eso ya lo medimos por satélite— y, sobre todo, </w:t>
+        <w:t xml:space="preserve"> es cuánta sombra dan, cuánto más fresco es un lugar con árboles —eso ya está medido por satélite—, cuánto carbono tienen acumulado, </w:t>
+      </w:r>
+      <w:r>
+        <w:rPr>
+          <w:b/>
+        </w:rPr>
+        <w:t>cuánto vale cada árbol según la ordenanza municipal</w:t>
+      </w:r>
+      <w:r>
+        <w:t xml:space="preserve">, y sobre todo </w:t>
       </w:r>
       <w:r>
         <w:rPr>
@@ -1589,7 +1997,7 @@
         <w:spacing w:after="120"/>
       </w:pPr>
       <w:r>
-        <w:t>Preferimos entregar tres cosas ciertas que diez que suenan bien.</w:t>
+        <w:t>Preferimos entregar cinco cosas ciertas que veinte que suenan bien.</w:t>
       </w:r>
     </w:p>
     <w:p>

</xml_diff>